<commit_message>
Add cadet position insignia and award badge proposal
New document proposing removable position slides (gold diamonds for
cadet officers, silver chevrons for cadet NCOs), year/unit patches,
duty armbands and a four-tier award badge system, compared against
USNA, USAFA, USMA, RMC, Sandhurst, India NDA and Russian practice.
Includes SVG/PNG design drawings and a cross-reference in the main
cadet regiment proposal.

Co-Authored-By: Claude Opus 5.5 <noreply@anthropic.com>
Claude-Session: https://claude.ai/code/session_01L8UQv8en9juEtmuFXTcboL
</commit_message>
<xml_diff>
--- a/ubhis-sonsogchiin-horoo/ubhis_sonsogchiin_horoo_sanal.docx
+++ b/ubhis-sonsogchiin-horoo/ubhis_sonsogchiin_horoo_sanal.docx
@@ -19618,6 +19618,27 @@
       </w:r>
     </w:p>
     <w:p>
+      <w:pPr>
+        <w:pStyle w:val="ListParagraph"/>
+        <w:numPr>
+          <w:ilvl w:val="0"/>
+          <w:numId w:val="2"/>
+        </w:numPr>
+        <w:spacing w:after="60" w:line="288"/>
+        <w:jc w:val="left"/>
+      </w:pPr>
+      <w:r>
+        <w:rPr>
+          <w:b/>
+          <w:bCs/>
+        </w:rPr>
+        <w:t xml:space="preserve">Ялгах тэмдэг, шагналын тэмдэг:</w:t>
+      </w:r>
+      <w:r>
+        <w:t xml:space="preserve"> Албан тушаалын ялгах тэмдэг, шагналын тэмдгийн дэлгэрэнгүй саналыг тусдаа баримт бичигт («Сонсогчийн хорооны ялгах тэмдэг, шагналын тэмдэг») боловсруулсан.</w:t>
+      </w:r>
+    </w:p>
+    <w:p>
       <w:r>
         <w:br w:type="page"/>
       </w:r>
@@ -24201,7 +24222,7 @@
         </w:rPr>
         <w:t xml:space="preserve">West Point — U.S. Corps of Cadets. </w:t>
       </w:r>
-      <w:hyperlink w:history="1" r:id="rIdxdlme4tekujl4jmloh8am">
+      <w:hyperlink w:history="1" r:id="rIdj-ro29cekqs_kjto7hq7x">
         <w:r>
           <w:rPr>
             <w:rStyle w:val="Hyperlink"/>
@@ -24228,7 +24249,7 @@
         </w:rPr>
         <w:t xml:space="preserve">West Point — Regiments and Companies. </w:t>
       </w:r>
-      <w:hyperlink w:history="1" r:id="rIdc2mbu281wgkqpvlqa3pbr">
+      <w:hyperlink w:history="1" r:id="rIdxnmaypbh-yhncikdctjn6">
         <w:r>
           <w:rPr>
             <w:rStyle w:val="Hyperlink"/>
@@ -24255,7 +24276,7 @@
         </w:rPr>
         <w:t xml:space="preserve">USMA — Class of 2024 Cadet Leadership Positions. </w:t>
       </w:r>
-      <w:hyperlink w:history="1" r:id="rId0sbo1yqe1bbccmch5_dsy">
+      <w:hyperlink w:history="1" r:id="rIdrgciicvytydlfr0uortvz">
         <w:r>
           <w:rPr>
             <w:rStyle w:val="Hyperlink"/>
@@ -24282,7 +24303,7 @@
         </w:rPr>
         <w:t xml:space="preserve">U.S. Army — West Point's new First Captain. </w:t>
       </w:r>
-      <w:hyperlink w:history="1" r:id="rIdvdegdrc0ockcih1f_v1jk">
+      <w:hyperlink w:history="1" r:id="rIdumvr_pj9derjl1gq9vmai">
         <w:r>
           <w:rPr>
             <w:rStyle w:val="Hyperlink"/>
@@ -24309,7 +24330,7 @@
         </w:rPr>
         <w:t xml:space="preserve">USNA — Life in the Brigade. </w:t>
       </w:r>
-      <w:hyperlink w:history="1" r:id="rId96vrpisxpcl3rcdryqj4i">
+      <w:hyperlink w:history="1" r:id="rId24coc94tzsbojxl2axsle">
         <w:r>
           <w:rPr>
             <w:rStyle w:val="Hyperlink"/>
@@ -24336,7 +24357,7 @@
         </w:rPr>
         <w:t xml:space="preserve">USNA — Fall Brigade Commander (2025). </w:t>
       </w:r>
-      <w:hyperlink w:history="1" r:id="rIdgnznmwiqbksfh0nzs5ua7">
+      <w:hyperlink w:history="1" r:id="rIdozyut-mrjeopplggzccez">
         <w:r>
           <w:rPr>
             <w:rStyle w:val="Hyperlink"/>
@@ -24363,7 +24384,7 @@
         </w:rPr>
         <w:t xml:space="preserve">USNA Memorial Hall — USNA Companies. </w:t>
       </w:r>
-      <w:hyperlink w:history="1" r:id="rIdra9ksrc6wxlthmtf6tosr">
+      <w:hyperlink w:history="1" r:id="rIdx5zr5qpwzvzxdr3mkmx3c">
         <w:r>
           <w:rPr>
             <w:rStyle w:val="Hyperlink"/>
@@ -24390,7 +24411,7 @@
         </w:rPr>
         <w:t xml:space="preserve">NPS — Selecting the brigade leadership at USNA: who are the stripers?. </w:t>
       </w:r>
-      <w:hyperlink w:history="1" r:id="rIdktnhsxbv0oigacsh1muvp">
+      <w:hyperlink w:history="1" r:id="rId2qkooikpra9yi4jlpypzx">
         <w:r>
           <w:rPr>
             <w:rStyle w:val="Hyperlink"/>
@@ -24417,7 +24438,7 @@
         </w:rPr>
         <w:t xml:space="preserve">USAFA Cadet Wing (Wikipedia). </w:t>
       </w:r>
-      <w:hyperlink w:history="1" r:id="rIdcxerj6x-cs56jzaegjler">
+      <w:hyperlink w:history="1" r:id="rIdivxxqlym8lpux_-ll_b3p">
         <w:r>
           <w:rPr>
             <w:rStyle w:val="Hyperlink"/>
@@ -24444,7 +24465,7 @@
         </w:rPr>
         <w:t xml:space="preserve">USAFA — Senior Cadet takes command of Cadet Wing. </w:t>
       </w:r>
-      <w:hyperlink w:history="1" r:id="rIdvc91-cuffyjxorbkybplm">
+      <w:hyperlink w:history="1" r:id="rId8dfvom3s-_iyapil8atio">
         <w:r>
           <w:rPr>
             <w:rStyle w:val="Hyperlink"/>
@@ -24471,7 +24492,7 @@
         </w:rPr>
         <w:t xml:space="preserve">DND Canada — RMC Context. </w:t>
       </w:r>
-      <w:hyperlink w:history="1" r:id="rId00tmyjmns9gnw4tsmog6z">
+      <w:hyperlink w:history="1" r:id="rIdfakpa-dicnlswbm_hv-t3">
         <w:r>
           <w:rPr>
             <w:rStyle w:val="Hyperlink"/>
@@ -24498,7 +24519,7 @@
         </w:rPr>
         <w:t xml:space="preserve">RMC — Life at RMC. </w:t>
       </w:r>
-      <w:hyperlink w:history="1" r:id="rIdlmowwxb9iqhaxzafwevmc">
+      <w:hyperlink w:history="1" r:id="rIdu5xoxqypucefvsplxeqvj">
         <w:r>
           <w:rPr>
             <w:rStyle w:val="Hyperlink"/>
@@ -24525,7 +24546,7 @@
         </w:rPr>
         <w:t xml:space="preserve">e-Veritas — History of RMC Squadron Names. </w:t>
       </w:r>
-      <w:hyperlink w:history="1" r:id="rId9qqar42blwyc4hekfpccn">
+      <w:hyperlink w:history="1" r:id="rIdeybiy4slecoghcjmcj36_">
         <w:r>
           <w:rPr>
             <w:rStyle w:val="Hyperlink"/>
@@ -24552,7 +24573,7 @@
         </w:rPr>
         <w:t xml:space="preserve">防衛大学校 — 学生生活. </w:t>
       </w:r>
-      <w:hyperlink w:history="1" r:id="rIdyusnvvepe1udqlmnwvuxq">
+      <w:hyperlink w:history="1" r:id="rIdcluf5htpocvz4ugft7oyn">
         <w:r>
           <w:rPr>
             <w:rStyle w:val="Hyperlink"/>
@@ -24579,7 +24600,7 @@
         </w:rPr>
         <w:t xml:space="preserve">防衛大学校 — Main Brochure. </w:t>
       </w:r>
-      <w:hyperlink w:history="1" r:id="rIdmgb2b5jeixf4yecvpcbth">
+      <w:hyperlink w:history="1" r:id="rIdaixm8ppesvgc9cirqh0dp">
         <w:r>
           <w:rPr>
             <w:rStyle w:val="Hyperlink"/>
@@ -24606,7 +24627,7 @@
         </w:rPr>
         <w:t xml:space="preserve">NoCut News — KMA cadet regiment commander. </w:t>
       </w:r>
-      <w:hyperlink w:history="1" r:id="rIdfknfoe9hf80e7e82rbzzv">
+      <w:hyperlink w:history="1" r:id="rIdfgny93k2sbyirzqxqphpm">
         <w:r>
           <w:rPr>
             <w:rStyle w:val="Hyperlink"/>
@@ -24633,7 +24654,7 @@
         </w:rPr>
         <w:t xml:space="preserve">National Defence Academy (India) (Wikipedia). </w:t>
       </w:r>
-      <w:hyperlink w:history="1" r:id="rId__5lckm-sieonnoubk2m0">
+      <w:hyperlink w:history="1" r:id="rIdgzs0o52w74yvdgcq6cpw4">
         <w:r>
           <w:rPr>
             <w:rStyle w:val="Hyperlink"/>
@@ -24660,7 +24681,7 @@
         </w:rPr>
         <w:t xml:space="preserve">ThePrint — NDA to add squadrons. </w:t>
       </w:r>
-      <w:hyperlink w:history="1" r:id="rIdqt7h-5xwmtr8n2oepmwjd">
+      <w:hyperlink w:history="1" r:id="rId58-oeuuauuz8unpfawv86">
         <w:r>
           <w:rPr>
             <w:rStyle w:val="Hyperlink"/>
@@ -24687,7 +24708,7 @@
         </w:rPr>
         <w:t xml:space="preserve">The Week — Khadakwasla: the cradle of officers (2025). </w:t>
       </w:r>
-      <w:hyperlink w:history="1" r:id="rIdw-hrzbbpb48mgdzzpifnv">
+      <w:hyperlink w:history="1" r:id="rIdjxqdxkom0ryxyqldw0n5g">
         <w:r>
           <w:rPr>
             <w:rStyle w:val="Hyperlink"/>
@@ -24714,7 +24735,7 @@
         </w:rPr>
         <w:t xml:space="preserve">Ikon.mn — ҮБХИС-ийн тухай мэдээ. </w:t>
       </w:r>
-      <w:hyperlink w:history="1" r:id="rIdrj2n48rofsaj0izfnmxst">
+      <w:hyperlink w:history="1" r:id="rIdrat0dhiay1jwvtxl9ohgj">
         <w:r>
           <w:rPr>
             <w:rStyle w:val="Hyperlink"/>

</xml_diff>